<commit_message>
Add Estate Configuration authority
</commit_message>
<xml_diff>
--- a/The Jira Observation Monitor Guide v2.docx
+++ b/The Jira Observation Monitor Guide v2.docx
@@ -7250,6 +7250,658 @@
     <w:p>
       <w:r>
         <w:t>This v2 edition retains the complete original appendices and full Git history. No detailed evidence has been collapsed into a milestone-only summary.</w:t>
+      </w:r>
+    </w:p>
+    <w:p>
+      <w:r>
+        <w:br w:type="page"/>
+      </w:r>
+    </w:p>
+    <w:p>
+      <w:pPr>
+        <w:pStyle w:val="Title"/>
+      </w:pPr>
+      <w:r>
+        <w:t>Estate Configuration Authority Milestone</w:t>
+      </w:r>
+    </w:p>
+    <w:p>
+      <w:r>
+        <w:t>Validation date: 14 August 2026</w:t>
+      </w:r>
+    </w:p>
+    <w:p>
+      <w:r>
+        <w:t>Status: Live validated, pending BOOKSYNC commit</w:t>
+      </w:r>
+    </w:p>
+    <w:p>
+      <w:pPr>
+        <w:pStyle w:val="Heading1"/>
+      </w:pPr>
+      <w:r>
+        <w:t>Validated Authority</w:t>
+      </w:r>
+    </w:p>
+    <w:p>
+      <w:pPr>
+        <w:pStyle w:val="ListBullet"/>
+      </w:pPr>
+      <w:r>
+        <w:t>Estate sites: 4</w:t>
+      </w:r>
+    </w:p>
+    <w:p>
+      <w:pPr>
+        <w:pStyle w:val="ListBullet"/>
+      </w:pPr>
+      <w:r>
+        <w:t>Monitored sites: 4</w:t>
+      </w:r>
+    </w:p>
+    <w:p>
+      <w:pPr>
+        <w:pStyle w:val="ListBullet"/>
+      </w:pPr>
+      <w:r>
+        <w:t>Tenant identity: 4 sites, 100% coverage</w:t>
+      </w:r>
+    </w:p>
+    <w:p>
+      <w:pPr>
+        <w:pStyle w:val="ListBullet"/>
+      </w:pPr>
+      <w:r>
+        <w:t>Resource mapping: 3 sites, 75% coverage</w:t>
+      </w:r>
+    </w:p>
+    <w:p>
+      <w:pPr>
+        <w:pStyle w:val="ListBullet"/>
+      </w:pPr>
+      <w:r>
+        <w:t>Administrative ownership: 3 sites, 75% coverage</w:t>
+      </w:r>
+    </w:p>
+    <w:p>
+      <w:pPr>
+        <w:pStyle w:val="ListBullet"/>
+      </w:pPr>
+      <w:r>
+        <w:t>Verified role assignments: 97</w:t>
+      </w:r>
+    </w:p>
+    <w:p>
+      <w:pPr>
+        <w:pStyle w:val="ListBullet"/>
+      </w:pPr>
+      <w:r>
+        <w:t>Authority gaps: 7</w:t>
+      </w:r>
+    </w:p>
+    <w:p>
+      <w:pPr>
+        <w:pStyle w:val="ListBullet"/>
+      </w:pPr>
+      <w:r>
+        <w:t>Failed sources: 0</w:t>
+      </w:r>
+    </w:p>
+    <w:p>
+      <w:pPr>
+        <w:pStyle w:val="ListBullet"/>
+      </w:pPr>
+      <w:r>
+        <w:t>Live collection during page load: disabled</w:t>
+      </w:r>
+    </w:p>
+    <w:p>
+      <w:pPr>
+        <w:pStyle w:val="Heading1"/>
+      </w:pPr>
+      <w:r>
+        <w:t>Site-Level Authority</w:t>
+      </w:r>
+    </w:p>
+    <w:tbl>
+      <w:tblPr>
+        <w:tblStyle w:val="LightShading-Accent1"/>
+        <w:tblW w:type="auto" w:w="0"/>
+        <w:tblLook w:firstColumn="1" w:firstRow="1" w:lastColumn="0" w:lastRow="0" w:noHBand="0" w:noVBand="1" w:val="04A0"/>
+      </w:tblPr>
+      <w:tblGrid>
+        <w:gridCol w:w="1656"/>
+        <w:gridCol w:w="1656"/>
+        <w:gridCol w:w="1656"/>
+        <w:gridCol w:w="1656"/>
+        <w:gridCol w:w="1656"/>
+        <w:gridCol w:w="1656"/>
+      </w:tblGrid>
+      <w:tr>
+        <w:tc>
+          <w:tcPr>
+            <w:tcW w:type="dxa" w:w="1656"/>
+          </w:tcPr>
+          <w:p>
+            <w:r>
+              <w:t>Site</w:t>
+            </w:r>
+          </w:p>
+        </w:tc>
+        <w:tc>
+          <w:tcPr>
+            <w:tcW w:type="dxa" w:w="1656"/>
+          </w:tcPr>
+          <w:p>
+            <w:r>
+              <w:t>Tenant identity</w:t>
+            </w:r>
+          </w:p>
+        </w:tc>
+        <w:tc>
+          <w:tcPr>
+            <w:tcW w:type="dxa" w:w="1656"/>
+          </w:tcPr>
+          <w:p>
+            <w:r>
+              <w:t>Resource mapping</w:t>
+            </w:r>
+          </w:p>
+        </w:tc>
+        <w:tc>
+          <w:tcPr>
+            <w:tcW w:type="dxa" w:w="1656"/>
+          </w:tcPr>
+          <w:p>
+            <w:r>
+              <w:t>Ownership</w:t>
+            </w:r>
+          </w:p>
+        </w:tc>
+        <w:tc>
+          <w:tcPr>
+            <w:tcW w:type="dxa" w:w="1656"/>
+          </w:tcPr>
+          <w:p>
+            <w:r>
+              <w:t>Assignments</w:t>
+            </w:r>
+          </w:p>
+        </w:tc>
+        <w:tc>
+          <w:tcPr>
+            <w:tcW w:type="dxa" w:w="1656"/>
+          </w:tcPr>
+          <w:p>
+            <w:r>
+              <w:t>Products</w:t>
+            </w:r>
+          </w:p>
+        </w:tc>
+      </w:tr>
+      <w:tr>
+        <w:tc>
+          <w:tcPr>
+            <w:tcW w:type="dxa" w:w="1656"/>
+          </w:tcPr>
+          <w:p>
+            <w:r>
+              <w:t>gli-delivery-tm</w:t>
+            </w:r>
+          </w:p>
+        </w:tc>
+        <w:tc>
+          <w:tcPr>
+            <w:tcW w:type="dxa" w:w="1656"/>
+          </w:tcPr>
+          <w:p>
+            <w:r>
+              <w:t>Available</w:t>
+            </w:r>
+          </w:p>
+        </w:tc>
+        <w:tc>
+          <w:tcPr>
+            <w:tcW w:type="dxa" w:w="1656"/>
+          </w:tcPr>
+          <w:p>
+            <w:r>
+              <w:t>Available</w:t>
+            </w:r>
+          </w:p>
+        </w:tc>
+        <w:tc>
+          <w:tcPr>
+            <w:tcW w:type="dxa" w:w="1656"/>
+          </w:tcPr>
+          <w:p>
+            <w:r>
+              <w:t>Available</w:t>
+            </w:r>
+          </w:p>
+        </w:tc>
+        <w:tc>
+          <w:tcPr>
+            <w:tcW w:type="dxa" w:w="1656"/>
+          </w:tcPr>
+          <w:p>
+            <w:r>
+              <w:t>13</w:t>
+            </w:r>
+          </w:p>
+        </w:tc>
+        <w:tc>
+          <w:tcPr>
+            <w:tcW w:type="dxa" w:w="1656"/>
+          </w:tcPr>
+          <w:p>
+            <w:r>
+              <w:t>Jira Software</w:t>
+            </w:r>
+          </w:p>
+        </w:tc>
+      </w:tr>
+      <w:tr>
+        <w:tc>
+          <w:tcPr>
+            <w:tcW w:type="dxa" w:w="1656"/>
+          </w:tcPr>
+          <w:p>
+            <w:r>
+              <w:t>gli-global-technology</w:t>
+            </w:r>
+          </w:p>
+        </w:tc>
+        <w:tc>
+          <w:tcPr>
+            <w:tcW w:type="dxa" w:w="1656"/>
+          </w:tcPr>
+          <w:p>
+            <w:r>
+              <w:t>Available</w:t>
+            </w:r>
+          </w:p>
+        </w:tc>
+        <w:tc>
+          <w:tcPr>
+            <w:tcW w:type="dxa" w:w="1656"/>
+          </w:tcPr>
+          <w:p>
+            <w:r>
+              <w:t>Available</w:t>
+            </w:r>
+          </w:p>
+        </w:tc>
+        <w:tc>
+          <w:tcPr>
+            <w:tcW w:type="dxa" w:w="1656"/>
+          </w:tcPr>
+          <w:p>
+            <w:r>
+              <w:t>Available</w:t>
+            </w:r>
+          </w:p>
+        </w:tc>
+        <w:tc>
+          <w:tcPr>
+            <w:tcW w:type="dxa" w:w="1656"/>
+          </w:tcPr>
+          <w:p>
+            <w:r>
+              <w:t>29</w:t>
+            </w:r>
+          </w:p>
+        </w:tc>
+        <w:tc>
+          <w:tcPr>
+            <w:tcW w:type="dxa" w:w="1656"/>
+          </w:tcPr>
+          <w:p>
+            <w:r>
+              <w:t>Jira Software</w:t>
+            </w:r>
+          </w:p>
+        </w:tc>
+      </w:tr>
+      <w:tr>
+        <w:tc>
+          <w:tcPr>
+            <w:tcW w:type="dxa" w:w="1656"/>
+          </w:tcPr>
+          <w:p>
+            <w:r>
+              <w:t>gli-it-project</w:t>
+            </w:r>
+          </w:p>
+        </w:tc>
+        <w:tc>
+          <w:tcPr>
+            <w:tcW w:type="dxa" w:w="1656"/>
+          </w:tcPr>
+          <w:p>
+            <w:r>
+              <w:t>Available</w:t>
+            </w:r>
+          </w:p>
+        </w:tc>
+        <w:tc>
+          <w:tcPr>
+            <w:tcW w:type="dxa" w:w="1656"/>
+          </w:tcPr>
+          <w:p>
+            <w:r>
+              <w:t>Available</w:t>
+            </w:r>
+          </w:p>
+        </w:tc>
+        <w:tc>
+          <w:tcPr>
+            <w:tcW w:type="dxa" w:w="1656"/>
+          </w:tcPr>
+          <w:p>
+            <w:r>
+              <w:t>Available</w:t>
+            </w:r>
+          </w:p>
+        </w:tc>
+        <w:tc>
+          <w:tcPr>
+            <w:tcW w:type="dxa" w:w="1656"/>
+          </w:tcPr>
+          <w:p>
+            <w:r>
+              <w:t>55</w:t>
+            </w:r>
+          </w:p>
+        </w:tc>
+        <w:tc>
+          <w:tcPr>
+            <w:tcW w:type="dxa" w:w="1656"/>
+          </w:tcPr>
+          <w:p>
+            <w:r>
+              <w:t>Confluence, Jira Software</w:t>
+            </w:r>
+          </w:p>
+        </w:tc>
+      </w:tr>
+      <w:tr>
+        <w:tc>
+          <w:tcPr>
+            <w:tcW w:type="dxa" w:w="1656"/>
+          </w:tcPr>
+          <w:p>
+            <w:r>
+              <w:t>gli-tracker</w:t>
+            </w:r>
+          </w:p>
+        </w:tc>
+        <w:tc>
+          <w:tcPr>
+            <w:tcW w:type="dxa" w:w="1656"/>
+          </w:tcPr>
+          <w:p>
+            <w:r>
+              <w:t>Available</w:t>
+            </w:r>
+          </w:p>
+        </w:tc>
+        <w:tc>
+          <w:tcPr>
+            <w:tcW w:type="dxa" w:w="1656"/>
+          </w:tcPr>
+          <w:p>
+            <w:r>
+              <w:t>Unavailable</w:t>
+            </w:r>
+          </w:p>
+        </w:tc>
+        <w:tc>
+          <w:tcPr>
+            <w:tcW w:type="dxa" w:w="1656"/>
+          </w:tcPr>
+          <w:p>
+            <w:r>
+              <w:t>Unavailable</w:t>
+            </w:r>
+          </w:p>
+        </w:tc>
+        <w:tc>
+          <w:tcPr>
+            <w:tcW w:type="dxa" w:w="1656"/>
+          </w:tcPr>
+          <w:p>
+            <w:r>
+              <w:t>Unavailable</w:t>
+            </w:r>
+          </w:p>
+        </w:tc>
+        <w:tc>
+          <w:tcPr>
+            <w:tcW w:type="dxa" w:w="1656"/>
+          </w:tcPr>
+          <w:p>
+            <w:r>
+              <w:t>Unavailable</w:t>
+            </w:r>
+          </w:p>
+        </w:tc>
+      </w:tr>
+    </w:tbl>
+    <w:p>
+      <w:pPr>
+        <w:pStyle w:val="Heading1"/>
+      </w:pPr>
+      <w:r>
+        <w:t>Configuration Gaps</w:t>
+      </w:r>
+    </w:p>
+    <w:p>
+      <w:pPr>
+        <w:pStyle w:val="ListNumber"/>
+      </w:pPr>
+      <w:r>
+        <w:t>Business classification is unavailable because the existing classification field represents monitoring lifecycle.</w:t>
+      </w:r>
+    </w:p>
+    <w:p>
+      <w:pPr>
+        <w:pStyle w:val="ListNumber"/>
+      </w:pPr>
+      <w:r>
+        <w:t>Criticality is unavailable.</w:t>
+      </w:r>
+    </w:p>
+    <w:p>
+      <w:pPr>
+        <w:pStyle w:val="ListNumber"/>
+      </w:pPr>
+      <w:r>
+        <w:t>Region is unavailable.</w:t>
+      </w:r>
+    </w:p>
+    <w:p>
+      <w:pPr>
+        <w:pStyle w:val="ListNumber"/>
+      </w:pPr>
+      <w:r>
+        <w:t>Business unit is unavailable.</w:t>
+      </w:r>
+    </w:p>
+    <w:p>
+      <w:pPr>
+        <w:pStyle w:val="ListNumber"/>
+      </w:pPr>
+      <w:r>
+        <w:t>Tags are unavailable.</w:t>
+      </w:r>
+    </w:p>
+    <w:p>
+      <w:pPr>
+        <w:pStyle w:val="ListNumber"/>
+      </w:pPr>
+      <w:r>
+        <w:t>Resource mapping coverage is partial because gli-tracker has tenant identity but no proven product-resource mapping.</w:t>
+      </w:r>
+    </w:p>
+    <w:p>
+      <w:pPr>
+        <w:pStyle w:val="ListNumber"/>
+      </w:pPr>
+      <w:r>
+        <w:t>Administrative ownership coverage is partial because gli-tracker has no safe mapped resource and verified role-assignment evidence.</w:t>
+      </w:r>
+    </w:p>
+    <w:p>
+      <w:pPr>
+        <w:pStyle w:val="Heading1"/>
+      </w:pPr>
+      <w:r>
+        <w:t>Authority Sources</w:t>
+      </w:r>
+    </w:p>
+    <w:p>
+      <w:pPr>
+        <w:pStyle w:val="ListBullet"/>
+      </w:pPr>
+      <w:r>
+        <w:t>runtime/data/site_registry.json</w:t>
+      </w:r>
+    </w:p>
+    <w:p>
+      <w:pPr>
+        <w:pStyle w:val="ListBullet"/>
+      </w:pPr>
+      <w:r>
+        <w:t>runtime/data/estate_admin_site_inventory_v1.json</w:t>
+      </w:r>
+    </w:p>
+    <w:p>
+      <w:pPr>
+        <w:pStyle w:val="ListBullet"/>
+      </w:pPr>
+      <w:r>
+        <w:t>runtime/data/estate_discovery_authority_v1.json</w:t>
+      </w:r>
+    </w:p>
+    <w:p>
+      <w:pPr>
+        <w:pStyle w:val="ListBullet"/>
+      </w:pPr>
+      <w:r>
+        <w:t>runtime/data/estate_admin_contacts_v1.json</w:t>
+      </w:r>
+    </w:p>
+    <w:p>
+      <w:pPr>
+        <w:pStyle w:val="ListBullet"/>
+      </w:pPr>
+      <w:r>
+        <w:t>runtime/data/estate_site_resource_mapping_v1.json</w:t>
+      </w:r>
+    </w:p>
+    <w:p>
+      <w:pPr>
+        <w:pStyle w:val="ListBullet"/>
+      </w:pPr>
+      <w:r>
+        <w:t>runtime/data/estate_site_tenant_identity_v1.json</w:t>
+      </w:r>
+    </w:p>
+    <w:p>
+      <w:pPr>
+        <w:pStyle w:val="Heading1"/>
+      </w:pPr>
+      <w:r>
+        <w:t>Owner Files</w:t>
+      </w:r>
+    </w:p>
+    <w:p>
+      <w:pPr>
+        <w:pStyle w:val="ListBullet"/>
+      </w:pPr>
+      <w:r>
+        <w:t>app/web.py</w:t>
+      </w:r>
+    </w:p>
+    <w:p>
+      <w:pPr>
+        <w:pStyle w:val="ListBullet"/>
+      </w:pPr>
+      <w:r>
+        <w:t>templates/admin_estate_configuration.html</w:t>
+      </w:r>
+    </w:p>
+    <w:p>
+      <w:pPr>
+        <w:pStyle w:val="ListBullet"/>
+      </w:pPr>
+      <w:r>
+        <w:t>static/js/jom_admin_estate_configuration_v1.js</w:t>
+      </w:r>
+    </w:p>
+    <w:p>
+      <w:pPr>
+        <w:pStyle w:val="ListBullet"/>
+      </w:pPr>
+      <w:r>
+        <w:t>static/css/jom_admin_estate_configuration_v1.css</w:t>
+      </w:r>
+    </w:p>
+    <w:p>
+      <w:pPr>
+        <w:pStyle w:val="ListBullet"/>
+      </w:pPr>
+      <w:r>
+        <w:t>scripts/validate_estate_configuration_v1.py</w:t>
+      </w:r>
+    </w:p>
+    <w:p>
+      <w:pPr>
+        <w:pStyle w:val="Heading1"/>
+      </w:pPr>
+      <w:r>
+        <w:t>Truth and Privacy Controls</w:t>
+      </w:r>
+    </w:p>
+    <w:p>
+      <w:pPr>
+        <w:pStyle w:val="ListBullet"/>
+      </w:pPr>
+      <w:r>
+        <w:t>No collector runs during page load.</w:t>
+      </w:r>
+    </w:p>
+    <w:p>
+      <w:pPr>
+        <w:pStyle w:val="ListBullet"/>
+      </w:pPr>
+      <w:r>
+        <w:t>Missing ownership is unavailable, not zero.</w:t>
+      </w:r>
+    </w:p>
+    <w:p>
+      <w:pPr>
+        <w:pStyle w:val="ListBullet"/>
+      </w:pPr>
+      <w:r>
+        <w:t>Role-assignment counts are not unique-person counts.</w:t>
+      </w:r>
+    </w:p>
+    <w:p>
+      <w:pPr>
+        <w:pStyle w:val="ListBullet"/>
+      </w:pPr>
+      <w:r>
+        <w:t>Names, email addresses, account IDs and directory IDs are excluded.</w:t>
+      </w:r>
+    </w:p>
+    <w:p>
+      <w:pPr>
+        <w:pStyle w:val="ListBullet"/>
+      </w:pPr>
+      <w:r>
+        <w:t>Differing source timestamps remain visible.</w:t>
       </w:r>
     </w:p>
     <w:sectPr>

</xml_diff>